<commit_message>
Fourth revision: one primary analysis, a corrected Rotterdam endpoint, and softer claims
</commit_message>
<xml_diff>
--- a/explainer/文章解读_中文.docx
+++ b/explainer/文章解读_中文.docx
@@ -35,7 +35,7 @@
     </w:p>
     <w:p>
       <w:pPr>
-        <w:spacing w:after="90" w:before="200"/>
+        <w:spacing w:after="78" w:before="170"/>
       </w:pPr>
       <w:r>
         <w:rPr>
@@ -51,18 +51,18 @@
     </w:p>
     <w:p>
       <w:pPr>
-        <w:spacing w:after="140" w:line="285"/>
-        <w:jc w:val="both"/>
-      </w:pPr>
-      <w:r>
-        <w:rPr>
-          <w:rFonts w:ascii="Noto Serif CJK SC" w:cs="Noto Serif CJK SC" w:eastAsia="Noto Serif CJK SC" w:hAnsi="Noto Serif CJK SC"/>
-          <w:b w:val="false"/>
-          <w:bCs w:val="false"/>
-          <w:sz w:val="19"/>
-          <w:szCs w:val="19"/>
-        </w:rPr>
-        <w:t xml:space="preserve">Trial Pathfinder（Liu 等，Nature 2021）用 Shapley 值找出「限制了人数却没带来疗效」的入组标准并放宽，宣称由此既能多纳入病人、又能得到更好的疗效估计。我们把这两个承诺分开做了样本外检验，两轮审稿之后的结论是：</w:t>
+        <w:spacing w:after="140" w:line="262"/>
+        <w:jc w:val="both"/>
+      </w:pPr>
+      <w:r>
+        <w:rPr>
+          <w:rFonts w:ascii="Noto Serif CJK SC" w:cs="Noto Serif CJK SC" w:eastAsia="Noto Serif CJK SC" w:hAnsi="Noto Serif CJK SC"/>
+          <w:b w:val="false"/>
+          <w:bCs w:val="false"/>
+          <w:sz w:val="19"/>
+          <w:szCs w:val="19"/>
+        </w:rPr>
+        <w:t xml:space="preserve">Trial Pathfinder（Liu 等，Nature 2021）用 Shapley 值找出「限制了人数却没带来疗效」的入组标准并放宽，宣称由此既能多纳入病人、又能得到更好的疗效估计。我们把这两个承诺分开做了样本外检验，四轮审稿之后的结论是：</w:t>
       </w:r>
       <w:r>
         <w:rPr>
@@ -82,7 +82,27 @@
           <w:sz w:val="19"/>
           <w:szCs w:val="19"/>
         </w:rPr>
-        <w:t xml:space="preserve">——把规则放到「所有 512 个子集」里去比，在相同入组人数下它的风险比优势真实但不大，而它落在「人数—风险比」帕累托前沿上的比例只有 1.6% 和 3.0%。至于疗效估计要多少数据才够，我们的答案是</w:t>
+        <w:t xml:space="preserve">——把规则放到「所有 512 个子集」里去比，在相同入组人数下它是否还有优势，</w:t>
+      </w:r>
+      <w:r>
+        <w:rPr>
+          <w:rFonts w:ascii="Noto Sans CJK SC" w:cs="Noto Sans CJK SC" w:eastAsia="Noto Sans CJK SC" w:hAnsi="Noto Sans CJK SC"/>
+          <w:b/>
+          <w:bCs/>
+          <w:sz w:val="19"/>
+          <w:szCs w:val="19"/>
+        </w:rPr>
+        <w:t xml:space="preserve">这两个队列的规模判不出来</w:t>
+      </w:r>
+      <w:r>
+        <w:rPr>
+          <w:rFonts w:ascii="Noto Serif CJK SC" w:cs="Noto Serif CJK SC" w:eastAsia="Noto Serif CJK SC" w:hAnsi="Noto Serif CJK SC"/>
+          <w:b w:val="false"/>
+          <w:bCs w:val="false"/>
+          <w:sz w:val="19"/>
+          <w:szCs w:val="19"/>
+        </w:rPr>
+        <w:t xml:space="preserve">：点估计在 colon 是 63.4%、Rotterdam 是 57.1%，但把不确定性做到病人层面之后，区间都包含 0.5。它落在「人数—风险比」经验前沿上的比例只有 3.0% 和 1.0%；不过这个前沿本身是从同一批留出数据里挑最优挑出来的，带乐观偏倚，我们另外量化了这个偏倚有多大。至于疗效估计要多少数据才够，我们的答案是</w:t>
       </w:r>
       <w:r>
         <w:rPr>
@@ -102,12 +122,32 @@
           <w:sz w:val="19"/>
           <w:szCs w:val="19"/>
         </w:rPr>
-        <w:t xml:space="preserve">：决定这件事的是「最强的那条稀释性标准有多强」，而那恰恰是这个分析本身要去发现的量。这是一个否定性结论，也是我们认为最有用的一条。</w:t>
-      </w:r>
-    </w:p>
-    <w:p>
-      <w:pPr>
-        <w:spacing w:after="90" w:before="200"/>
+        <w:t xml:space="preserve">，而且我们也</w:t>
+      </w:r>
+      <w:r>
+        <w:rPr>
+          <w:rFonts w:ascii="Noto Sans CJK SC" w:cs="Noto Sans CJK SC" w:eastAsia="Noto Sans CJK SC" w:hAnsi="Noto Sans CJK SC"/>
+          <w:b/>
+          <w:bCs/>
+          <w:sz w:val="19"/>
+          <w:szCs w:val="19"/>
+        </w:rPr>
+        <w:t xml:space="preserve">说不出决定它的是哪个量</w:t>
+      </w:r>
+      <w:r>
+        <w:rPr>
+          <w:rFonts w:ascii="Noto Serif CJK SC" w:cs="Noto Serif CJK SC" w:eastAsia="Noto Serif CJK SC" w:hAnsi="Noto Serif CJK SC"/>
+          <w:b w:val="false"/>
+          <w:bCs w:val="false"/>
+          <w:sz w:val="19"/>
+          <w:szCs w:val="19"/>
+        </w:rPr>
+        <w:t xml:space="preserve">——第三轮我们曾说是「最强的那条稀释性标准」，这一条已经撤回。这是一个否定性结论，也是我们认为最有用的一条。</w:t>
+      </w:r>
+    </w:p>
+    <w:p>
+      <w:pPr>
+        <w:spacing w:after="78" w:before="170"/>
       </w:pPr>
       <w:r>
         <w:rPr>
@@ -123,39 +163,39 @@
     </w:p>
     <w:p>
       <w:pPr>
-        <w:spacing w:after="100" w:line="285"/>
-        <w:jc w:val="both"/>
-      </w:pPr>
-      <w:r>
-        <w:rPr>
-          <w:rFonts w:ascii="Noto Serif CJK SC" w:cs="Noto Serif CJK SC" w:eastAsia="Noto Serif CJK SC" w:hAnsi="Noto Serif CJK SC"/>
-          <w:b w:val="false"/>
-          <w:bCs w:val="false"/>
-          <w:sz w:val="19"/>
-          <w:szCs w:val="19"/>
-        </w:rPr>
-        <w:t xml:space="preserve">肿瘤试验的入组标准往往过严。Trial Pathfinder 把每条标准看成合作博弈的参与者，用 Shapley 值分摊各自对疗效估计的边际贡献，值为负的保留、其余放宽；在一个肺癌真实世界数据库上它同时放大了合格人群、降低了风险比。</w:t>
-      </w:r>
-    </w:p>
-    <w:p>
-      <w:pPr>
-        <w:spacing w:after="100" w:line="285"/>
-        <w:jc w:val="both"/>
-      </w:pPr>
-      <w:r>
-        <w:rPr>
-          <w:rFonts w:ascii="Noto Serif CJK SC" w:cs="Noto Serif CJK SC" w:eastAsia="Noto Serif CJK SC" w:hAnsi="Noto Serif CJK SC"/>
-          <w:b w:val="false"/>
-          <w:bCs w:val="false"/>
-          <w:sz w:val="19"/>
-          <w:szCs w:val="19"/>
-        </w:rPr>
-        <w:t xml:space="preserve">我们注意到三件事：已有评价都是样本内的（标准和效果在同一批人身上）；「更多病人」和「更好估计」被当成一对报告，但没有理由认为两者需要同样多的数据、甚至是同一类命题；风险比不可折叠，缩小人群本身就会让它移动。</w:t>
-      </w:r>
-    </w:p>
-    <w:p>
-      <w:pPr>
-        <w:spacing w:after="90" w:before="200"/>
+        <w:spacing w:after="78" w:line="262"/>
+        <w:jc w:val="both"/>
+      </w:pPr>
+      <w:r>
+        <w:rPr>
+          <w:rFonts w:ascii="Noto Serif CJK SC" w:cs="Noto Serif CJK SC" w:eastAsia="Noto Serif CJK SC" w:hAnsi="Noto Serif CJK SC"/>
+          <w:b w:val="false"/>
+          <w:bCs w:val="false"/>
+          <w:sz w:val="19"/>
+          <w:szCs w:val="19"/>
+        </w:rPr>
+        <w:t xml:space="preserve">Trial Pathfinder 把每条入组标准看成合作博弈的参与者，用 Shapley 值分摊各自对疗效估计的边际贡献，值为负的保留、其余放宽；在一个肺癌真实世界数据库上它同时放大了合格人群、降低了风险比。</w:t>
+      </w:r>
+    </w:p>
+    <w:p>
+      <w:pPr>
+        <w:spacing w:after="78" w:line="262"/>
+        <w:jc w:val="both"/>
+      </w:pPr>
+      <w:r>
+        <w:rPr>
+          <w:rFonts w:ascii="Noto Serif CJK SC" w:cs="Noto Serif CJK SC" w:eastAsia="Noto Serif CJK SC" w:hAnsi="Noto Serif CJK SC"/>
+          <w:b w:val="false"/>
+          <w:bCs w:val="false"/>
+          <w:sz w:val="19"/>
+          <w:szCs w:val="19"/>
+        </w:rPr>
+        <w:t xml:space="preserve">我们注意到三件事：已有评价都是样本内的；「更多病人」和「更好估计」被当成一对报告，但没有理由认为两者需要同样多的数据、甚至是同一类命题；风险比不可折叠，缩小人群本身就会让它移动。</w:t>
+      </w:r>
+    </w:p>
+    <w:p>
+      <w:pPr>
+        <w:spacing w:after="78" w:before="170"/>
       </w:pPr>
       <w:r>
         <w:rPr>
@@ -171,7 +211,7 @@
     </w:p>
     <w:p>
       <w:pPr>
-        <w:spacing w:after="70" w:line="285"/>
+        <w:spacing w:after="60" w:line="268"/>
         <w:ind w:left="300" w:hanging="300"/>
         <w:jc w:val="both"/>
       </w:pPr>
@@ -199,7 +239,7 @@
     </w:p>
     <w:p>
       <w:pPr>
-        <w:spacing w:after="70" w:line="285"/>
+        <w:spacing w:after="60" w:line="268"/>
         <w:ind w:left="300" w:hanging="300"/>
         <w:jc w:val="both"/>
       </w:pPr>
@@ -247,7 +287,7 @@
     </w:p>
     <w:p>
       <w:pPr>
-        <w:spacing w:after="70" w:line="285"/>
+        <w:spacing w:after="60" w:line="268"/>
         <w:ind w:left="300" w:hanging="300"/>
         <w:jc w:val="both"/>
       </w:pPr>
@@ -275,7 +315,7 @@
     </w:p>
     <w:p>
       <w:pPr>
-        <w:spacing w:after="70" w:line="285"/>
+        <w:spacing w:after="60" w:line="268"/>
         <w:ind w:left="300" w:hanging="300"/>
         <w:jc w:val="both"/>
       </w:pPr>
@@ -298,7 +338,7 @@
           <w:sz w:val="19"/>
           <w:szCs w:val="19"/>
         </w:rPr>
-        <w:t xml:space="preserve">评分集固定 10 万人、真值已知，只让拟合集变化；再用 2⁴ 分辨率 IV 部分因子设计在六个因子上各取两水平，共 16 个情景，报告</w:t>
+        <w:t xml:space="preserve">评分集固定 10 万人、真值已知，只让拟合集变化；再用分辨率 IV 部分因子设计在六个因子上各取两水平共 16 个情景，报告</w:t>
       </w:r>
       <w:r>
         <w:rPr>
@@ -318,28 +358,28 @@
           <w:sz w:val="19"/>
           <w:szCs w:val="19"/>
         </w:rPr>
-        <w:t xml:space="preserve">而不是估计阈值。</w:t>
-      </w:r>
-    </w:p>
-    <w:p>
-      <w:pPr>
-        <w:spacing w:after="100" w:line="285"/>
-        <w:jc w:val="both"/>
-      </w:pPr>
-      <w:r>
-        <w:rPr>
-          <w:rFonts w:ascii="Noto Serif CJK SC" w:cs="Noto Serif CJK SC" w:eastAsia="Noto Serif CJK SC" w:hAnsi="Noto Serif CJK SC"/>
-          <w:b w:val="false"/>
-          <w:bCs w:val="false"/>
-          <w:sz w:val="19"/>
-          <w:szCs w:val="19"/>
-        </w:rPr>
-        <w:t xml:space="preserve">两个公开队列做基准：colon（辅助结肠癌随机试验，n = 619，完整方案保留 176 人 / 56 个事件）和 Rotterdam（乳腺癌登记队列，n = 2982，保留 419 人 / 191 个事件）。注意事件数比人数小得多，也更要紧。</w:t>
-      </w:r>
-    </w:p>
-    <w:p>
-      <w:pPr>
-        <w:spacing w:after="90" w:before="200"/>
+        <w:t xml:space="preserve">。</w:t>
+      </w:r>
+    </w:p>
+    <w:p>
+      <w:pPr>
+        <w:spacing w:after="78" w:line="262"/>
+        <w:jc w:val="both"/>
+      </w:pPr>
+      <w:r>
+        <w:rPr>
+          <w:rFonts w:ascii="Noto Serif CJK SC" w:cs="Noto Serif CJK SC" w:eastAsia="Noto Serif CJK SC" w:hAnsi="Noto Serif CJK SC"/>
+          <w:b w:val="false"/>
+          <w:bCs w:val="false"/>
+          <w:sz w:val="19"/>
+          <w:szCs w:val="19"/>
+        </w:rPr>
+        <w:t xml:space="preserve">两个公开队列做基准：colon（辅助结肠癌随机试验，n = 619，完整方案保留 176 人 / 56 事件）和 Rotterdam（乳腺癌登记队列，n = 2982，保留 419 人 / 191 事件）。事件数比人数小得多，也更要紧。</w:t>
+      </w:r>
+    </w:p>
+    <w:p>
+      <w:pPr>
+        <w:spacing w:after="78" w:before="170"/>
       </w:pPr>
       <w:r>
         <w:rPr>
@@ -365,39 +405,39 @@
           <w:sz w:val="19"/>
           <w:szCs w:val="19"/>
         </w:rPr>
-        <w:t xml:space="preserve">1. 「多纳入病人」主要是构造性的，规则也很少落在最优前沿上</w:t>
-      </w:r>
-    </w:p>
-    <w:p>
-      <w:pPr>
-        <w:spacing w:after="100" w:line="285"/>
-        <w:jc w:val="both"/>
-      </w:pPr>
-      <w:r>
-        <w:rPr>
-          <w:rFonts w:ascii="Noto Serif CJK SC" w:cs="Noto Serif CJK SC" w:eastAsia="Noto Serif CJK SC" w:hAnsi="Noto Serif CJK SC"/>
-          <w:b w:val="false"/>
-          <w:bCs w:val="false"/>
-          <w:sz w:val="19"/>
-          <w:szCs w:val="19"/>
-        </w:rPr>
-        <w:t xml:space="preserve">500 次划分里，合格人数的最小差值恰好是 0，从不为负——这正是子集关系决定的。规则在 99.0% 的划分里移除了至少一条标准，另有 1.2% 移除的标准在评分半边不起约束作用，两者之差 0.978 就是我们和文献一直在报的那个「承诺兑现率」。它衡量的是规则移除起约束作用的标准的频率，而不是移除得对不对。</w:t>
-      </w:r>
-    </w:p>
-    <w:p>
-      <w:pPr>
-        <w:spacing w:after="100" w:line="285"/>
-        <w:jc w:val="both"/>
-      </w:pPr>
-      <w:r>
-        <w:rPr>
-          <w:rFonts w:ascii="Noto Serif CJK SC" w:cs="Noto Serif CJK SC" w:eastAsia="Noto Serif CJK SC" w:hAnsi="Noto Serif CJK SC"/>
-          <w:b w:val="false"/>
-          <w:bCs w:val="false"/>
-          <w:sz w:val="19"/>
-          <w:szCs w:val="19"/>
-        </w:rPr>
-        <w:t xml:space="preserve">第一轮我们用「随机去掉同样条数」做对照，审稿人指出这不公平：规则和随机方案纳入的人数差很多（Rotterdam 442 vs 664），风险比是在不同的人群规模上比的。第二轮改成把</w:t>
+        <w:t xml:space="preserve">1. 「多纳入病人」主要是构造性的；规则很少落在经验前沿上，但这个前沿本身是乐观的</w:t>
+      </w:r>
+    </w:p>
+    <w:p>
+      <w:pPr>
+        <w:spacing w:after="78" w:line="262"/>
+        <w:jc w:val="both"/>
+      </w:pPr>
+      <w:r>
+        <w:rPr>
+          <w:rFonts w:ascii="Noto Serif CJK SC" w:cs="Noto Serif CJK SC" w:eastAsia="Noto Serif CJK SC" w:hAnsi="Noto Serif CJK SC"/>
+          <w:b w:val="false"/>
+          <w:bCs w:val="false"/>
+          <w:sz w:val="19"/>
+          <w:szCs w:val="19"/>
+        </w:rPr>
+        <w:t xml:space="preserve">500 次划分里，合格人数的最小差值恰好是 0，从不为负——这正是子集关系决定的。文献一直在报的那个 0.978「承诺兑现率」，衡量的是规则移除起约束作用的标准的频率，而不是移除得对不对。</w:t>
+      </w:r>
+    </w:p>
+    <w:p>
+      <w:pPr>
+        <w:spacing w:after="78" w:line="262"/>
+        <w:jc w:val="both"/>
+      </w:pPr>
+      <w:r>
+        <w:rPr>
+          <w:rFonts w:ascii="Noto Serif CJK SC" w:cs="Noto Serif CJK SC" w:eastAsia="Noto Serif CJK SC" w:hAnsi="Noto Serif CJK SC"/>
+          <w:b w:val="false"/>
+          <w:bCs w:val="false"/>
+          <w:sz w:val="19"/>
+          <w:szCs w:val="19"/>
+        </w:rPr>
+        <w:t xml:space="preserve">公平的对照是把</w:t>
       </w:r>
       <w:r>
         <w:rPr>
@@ -417,43 +457,139 @@
           <w:sz w:val="19"/>
           <w:szCs w:val="19"/>
         </w:rPr>
-        <w:t xml:space="preserve">都在留出的那一半上评分：在合格人数相差 10% 以内的子集中，规则的风险比更低的比例是 59.8%（colon）和 54.8%（Rotterdam）——真实但不大；在 RMST 上则是 42.7% 和 51.5%，不比随机好。</w:t>
-      </w:r>
-    </w:p>
-    <w:p>
-      <w:pPr>
-        <w:spacing w:after="100" w:line="285"/>
-        <w:jc w:val="both"/>
-      </w:pPr>
-      <w:r>
-        <w:rPr>
-          <w:rFonts w:ascii="Noto Serif CJK SC" w:cs="Noto Serif CJK SC" w:eastAsia="Noto Serif CJK SC" w:hAnsi="Noto Serif CJK SC"/>
-          <w:b w:val="false"/>
-          <w:bCs w:val="false"/>
-          <w:sz w:val="19"/>
-          <w:szCs w:val="19"/>
-        </w:rPr>
-        <w:t xml:space="preserve">更说明问题的是前沿分析：如果存在另一个子集，纳入人数不少于规则、风险比不高于规则，就说规则被支配了。规则</w:t>
-      </w:r>
-      <w:r>
-        <w:rPr>
-          <w:rFonts w:ascii="Noto Sans CJK SC" w:cs="Noto Sans CJK SC" w:eastAsia="Noto Sans CJK SC" w:hAnsi="Noto Sans CJK SC"/>
-          <w:b/>
-          <w:bCs/>
-          <w:sz w:val="19"/>
-          <w:szCs w:val="19"/>
-        </w:rPr>
-        <w:t xml:space="preserve">落在前沿上的比例只有 1.6% 和 3.0%</w:t>
-      </w:r>
-      <w:r>
-        <w:rPr>
-          <w:rFonts w:ascii="Noto Serif CJK SC" w:cs="Noto Serif CJK SC" w:eastAsia="Noto Serif CJK SC" w:hAnsi="Noto Serif CJK SC"/>
-          <w:b w:val="false"/>
-          <w:bCs w:val="false"/>
-          <w:sz w:val="19"/>
-          <w:szCs w:val="19"/>
-        </w:rPr>
-        <w:t xml:space="preserve">，中位有 72 和 60 个子集支配它。也就是说，规则并不是在优化「多纳人 vs 低风险比」这个取舍，而且样本外通常离可达前沿有相当距离。只跟完整方案比，这一切都看不见。</w:t>
+        <w:t xml:space="preserve">都在留出的那一半上评分（第一轮用「随机去掉同样条数」不公平，因为两者纳入的人数差很多）。在合格人数相差 10% 以内的子集中，规则的风险比更低的比例是 63.4%（colon）和 57.1%（Rotterdam），病人层面的区间分别是 [0.40, 0.86] 和 [0.39, 0.75]；在 RMST 上是 41.1% 和 59.0%。</w:t>
+      </w:r>
+      <w:r>
+        <w:rPr>
+          <w:rFonts w:ascii="Noto Sans CJK SC" w:cs="Noto Sans CJK SC" w:eastAsia="Noto Sans CJK SC" w:hAnsi="Noto Sans CJK SC"/>
+          <w:b/>
+          <w:bCs/>
+          <w:sz w:val="19"/>
+          <w:szCs w:val="19"/>
+        </w:rPr>
+        <w:t xml:space="preserve">所有这些区间都包含 0.5</w:t>
+      </w:r>
+      <w:r>
+        <w:rPr>
+          <w:rFonts w:ascii="Noto Serif CJK SC" w:cs="Noto Serif CJK SC" w:eastAsia="Noto Serif CJK SC" w:hAnsi="Noto Serif CJK SC"/>
+          <w:b w:val="false"/>
+          <w:bCs w:val="false"/>
+          <w:sz w:val="19"/>
+          <w:szCs w:val="19"/>
+        </w:rPr>
+        <w:t xml:space="preserve">——既证不出优势，也证不出没有优势。这是我们第三轮之后最重要的一处措辞改动。</w:t>
+      </w:r>
+    </w:p>
+    <w:p>
+      <w:pPr>
+        <w:spacing w:after="78" w:line="262"/>
+        <w:jc w:val="both"/>
+      </w:pPr>
+      <w:r>
+        <w:rPr>
+          <w:rFonts w:ascii="Noto Serif CJK SC" w:cs="Noto Serif CJK SC" w:eastAsia="Noto Serif CJK SC" w:hAnsi="Noto Serif CJK SC"/>
+          <w:b w:val="false"/>
+          <w:bCs w:val="false"/>
+          <w:sz w:val="19"/>
+          <w:szCs w:val="19"/>
+        </w:rPr>
+        <w:t xml:space="preserve">前沿分析：如果存在另一个子集，纳入人数不少于规则、风险比不高于规则，就说规则被支配了。规则</w:t>
+      </w:r>
+      <w:r>
+        <w:rPr>
+          <w:rFonts w:ascii="Noto Sans CJK SC" w:cs="Noto Sans CJK SC" w:eastAsia="Noto Sans CJK SC" w:hAnsi="Noto Sans CJK SC"/>
+          <w:b/>
+          <w:bCs/>
+          <w:sz w:val="19"/>
+          <w:szCs w:val="19"/>
+        </w:rPr>
+        <w:t xml:space="preserve">落在前沿上的比例只有 3.0% 和 1.0%</w:t>
+      </w:r>
+      <w:r>
+        <w:rPr>
+          <w:rFonts w:ascii="Noto Serif CJK SC" w:cs="Noto Serif CJK SC" w:eastAsia="Noto Serif CJK SC" w:hAnsi="Noto Serif CJK SC"/>
+          <w:b w:val="false"/>
+          <w:bCs w:val="false"/>
+          <w:sz w:val="19"/>
+          <w:szCs w:val="19"/>
+        </w:rPr>
+        <w:t xml:space="preserve">，中位有 117 和 85 个子集支配它。</w:t>
+      </w:r>
+    </w:p>
+    <w:p>
+      <w:pPr>
+        <w:spacing w:after="78" w:line="262"/>
+        <w:jc w:val="both"/>
+      </w:pPr>
+      <w:r>
+        <w:rPr>
+          <w:rFonts w:ascii="Noto Serif CJK SC" w:cs="Noto Serif CJK SC" w:eastAsia="Noto Serif CJK SC" w:hAnsi="Noto Serif CJK SC"/>
+          <w:b w:val="false"/>
+          <w:bCs w:val="false"/>
+          <w:sz w:val="19"/>
+          <w:szCs w:val="19"/>
+        </w:rPr>
+        <w:t xml:space="preserve">但审稿人第三轮指出：这个前沿是</w:t>
+      </w:r>
+      <w:r>
+        <w:rPr>
+          <w:rFonts w:ascii="Noto Sans CJK SC" w:cs="Noto Sans CJK SC" w:eastAsia="Noto Sans CJK SC" w:hAnsi="Noto Sans CJK SC"/>
+          <w:b/>
+          <w:bCs/>
+          <w:sz w:val="19"/>
+          <w:szCs w:val="19"/>
+        </w:rPr>
+        <w:t xml:space="preserve">在同一批留出数据上从 512 个带噪声的估计里挑最优挑出来的</w:t>
+      </w:r>
+      <w:r>
+        <w:rPr>
+          <w:rFonts w:ascii="Noto Serif CJK SC" w:cs="Noto Serif CJK SC" w:eastAsia="Noto Serif CJK SC" w:hAnsi="Noto Serif CJK SC"/>
+          <w:b w:val="false"/>
+          <w:bCs w:val="false"/>
+          <w:sz w:val="19"/>
+          <w:szCs w:val="19"/>
+        </w:rPr>
+        <w:t xml:space="preserve">，带「胜者诅咒」式的乐观偏倚。真值已知的模拟给出量级：表面支配者里只有 19.5% 在总体上真的支配，37.6% 能在另一半独立数据上重现。第四轮我们又在真实队列里做了</w:t>
+      </w:r>
+      <w:r>
+        <w:rPr>
+          <w:rFonts w:ascii="Noto Sans CJK SC" w:cs="Noto Sans CJK SC" w:eastAsia="Noto Sans CJK SC" w:hAnsi="Noto Sans CJK SC"/>
+          <w:b/>
+          <w:bCs/>
+          <w:sz w:val="19"/>
+          <w:szCs w:val="19"/>
+        </w:rPr>
+        <w:t xml:space="preserve">三分法</w:t>
+      </w:r>
+      <w:r>
+        <w:rPr>
+          <w:rFonts w:ascii="Noto Serif CJK SC" w:cs="Noto Serif CJK SC" w:eastAsia="Noto Serif CJK SC" w:hAnsi="Noto Serif CJK SC"/>
+          <w:b w:val="false"/>
+          <w:bCs w:val="false"/>
+          <w:sz w:val="19"/>
+          <w:szCs w:val="19"/>
+        </w:rPr>
+        <w:t xml:space="preserve">（一份拟合、一份挑支配者、一份完全没用过的做检验）：colon 中位 77 个表面支配者里，只有 35.3% 在没用过的那份上仍然支配；不过规则落在前沿上的比例本身变化不大（2.5% → 4.3%）。所以现在的说法是：规则离</w:t>
+      </w:r>
+      <w:r>
+        <w:rPr>
+          <w:rFonts w:ascii="Noto Sans CJK SC" w:cs="Noto Sans CJK SC" w:eastAsia="Noto Sans CJK SC" w:hAnsi="Noto Sans CJK SC"/>
+          <w:b/>
+          <w:bCs/>
+          <w:sz w:val="19"/>
+          <w:szCs w:val="19"/>
+        </w:rPr>
+        <w:t xml:space="preserve">这个带乐观偏倚的经验最优</w:t>
+      </w:r>
+      <w:r>
+        <w:rPr>
+          <w:rFonts w:ascii="Noto Serif CJK SC" w:cs="Noto Serif CJK SC" w:eastAsia="Noto Serif CJK SC" w:hAnsi="Noto Serif CJK SC"/>
+          <w:b w:val="false"/>
+          <w:bCs w:val="false"/>
+          <w:sz w:val="19"/>
+          <w:szCs w:val="19"/>
+        </w:rPr>
+        <w:t xml:space="preserve">有相当距离；它离真正的最优方案有多远，这两个队列答不了。</w:t>
       </w:r>
     </w:p>
     <w:p>
@@ -468,7 +604,7 @@
           <w:sz w:val="19"/>
           <w:szCs w:val="19"/>
         </w:rPr>
-        <w:t xml:space="preserve">2. 疗效估计这条承诺，两个队列都没守住，而且我们其实说不准</w:t>
+        <w:t xml:space="preserve">2. 疗效估计这条承诺：观察到的比例偏低，但这既不能说明没守住，也不能说明守住了</w:t>
       </w:r>
     </w:p>
     <w:tbl>
@@ -605,6 +741,92 @@
                 <w:sz w:val="17"/>
                 <w:szCs w:val="17"/>
               </w:rPr>
+              <w:t xml:space="preserve">终点；截断时间；划分次数</w:t>
+            </w:r>
+          </w:p>
+        </w:tc>
+        <w:tc>
+          <w:tcPr>
+            <w:tcW w:type="dxa" w:w="2300"/>
+            <w:tcMar>
+              <w:top w:type="dxa" w:w="55"/>
+              <w:left w:type="dxa" w:w="85"/>
+              <w:bottom w:type="dxa" w:w="55"/>
+              <w:right w:type="dxa" w:w="85"/>
+            </w:tcMar>
+          </w:tcPr>
+          <w:p>
+            <w:pPr>
+              <w:spacing w:after="0" w:line="250"/>
+              <w:jc w:val="right"/>
+            </w:pPr>
+            <w:r>
+              <w:rPr>
+                <w:rFonts w:ascii="Noto Serif CJK SC" w:cs="Noto Serif CJK SC" w:eastAsia="Noto Serif CJK SC" w:hAnsi="Noto Serif CJK SC"/>
+                <w:b w:val="false"/>
+                <w:bCs w:val="false"/>
+                <w:sz w:val="17"/>
+                <w:szCs w:val="17"/>
+              </w:rPr>
+              <w:t xml:space="preserve">time，status；1825 天；500</w:t>
+            </w:r>
+          </w:p>
+        </w:tc>
+        <w:tc>
+          <w:tcPr>
+            <w:tcW w:type="dxa" w:w="2300"/>
+            <w:tcMar>
+              <w:top w:type="dxa" w:w="55"/>
+              <w:left w:type="dxa" w:w="85"/>
+              <w:bottom w:type="dxa" w:w="55"/>
+              <w:right w:type="dxa" w:w="85"/>
+            </w:tcMar>
+          </w:tcPr>
+          <w:p>
+            <w:pPr>
+              <w:spacing w:after="0" w:line="250"/>
+              <w:jc w:val="right"/>
+            </w:pPr>
+            <w:r>
+              <w:rPr>
+                <w:rFonts w:ascii="Noto Serif CJK SC" w:cs="Noto Serif CJK SC" w:eastAsia="Noto Serif CJK SC" w:hAnsi="Noto Serif CJK SC"/>
+                <w:b w:val="false"/>
+                <w:bCs w:val="false"/>
+                <w:sz w:val="17"/>
+                <w:szCs w:val="17"/>
+              </w:rPr>
+              <w:t xml:space="preserve">dtime，death；2555 天；400</w:t>
+            </w:r>
+          </w:p>
+        </w:tc>
+      </w:tr>
+      <w:tr>
+        <w:trPr>
+          <w:cantSplit/>
+        </w:trPr>
+        <w:tc>
+          <w:tcPr>
+            <w:tcW w:type="dxa" w:w="2900"/>
+            <w:tcMar>
+              <w:top w:type="dxa" w:w="55"/>
+              <w:left w:type="dxa" w:w="85"/>
+              <w:bottom w:type="dxa" w:w="55"/>
+              <w:right w:type="dxa" w:w="85"/>
+            </w:tcMar>
+          </w:tcPr>
+          <w:p>
+            <w:pPr>
+              <w:spacing w:after="0" w:line="250"/>
+              <w:jc w:val="left"/>
+            </w:pPr>
+            <w:r>
+              <w:rPr>
+                <w:rFonts w:ascii="Noto Serif CJK SC" w:cs="Noto Serif CJK SC" w:eastAsia="Noto Serif CJK SC" w:hAnsi="Noto Serif CJK SC"/>
+                <w:b w:val="false"/>
+                <w:bCs w:val="false"/>
+                <w:sz w:val="17"/>
+                <w:szCs w:val="17"/>
+              </w:rPr>
               <w:t xml:space="preserve">多纳入人数</w:t>
             </w:r>
           </w:p>
@@ -632,7 +854,7 @@
                 <w:sz w:val="17"/>
                 <w:szCs w:val="17"/>
               </w:rPr>
-              <w:t xml:space="preserve">+59</w:t>
+              <w:t xml:space="preserve">+61</w:t>
             </w:r>
           </w:p>
         </w:tc>
@@ -659,7 +881,7 @@
                 <w:sz w:val="17"/>
                 <w:szCs w:val="17"/>
               </w:rPr>
-              <w:t xml:space="preserve">+229</w:t>
+              <w:t xml:space="preserve">+226</w:t>
             </w:r>
           </w:p>
         </w:tc>
@@ -718,7 +940,7 @@
                 <w:sz w:val="17"/>
                 <w:szCs w:val="17"/>
               </w:rPr>
-              <w:t xml:space="preserve">+0.078；0.270</w:t>
+              <w:t xml:space="preserve">+0.067；0.290</w:t>
             </w:r>
           </w:p>
         </w:tc>
@@ -745,7 +967,7 @@
                 <w:sz w:val="17"/>
                 <w:szCs w:val="17"/>
               </w:rPr>
-              <w:t xml:space="preserve">+0.001；0.497</w:t>
+              <w:t xml:space="preserve">+0.005；0.522</w:t>
             </w:r>
           </w:p>
         </w:tc>
@@ -804,7 +1026,7 @@
                 <w:sz w:val="17"/>
                 <w:szCs w:val="17"/>
               </w:rPr>
-              <w:t xml:space="preserve">−5.8 天；0.452</w:t>
+              <w:t xml:space="preserve">-1.4 天；0.508</w:t>
             </w:r>
           </w:p>
         </w:tc>
@@ -831,7 +1053,7 @@
                 <w:sz w:val="17"/>
                 <w:szCs w:val="17"/>
               </w:rPr>
-              <w:t xml:space="preserve">+6.9 天；0.580</w:t>
+              <w:t xml:space="preserve">+5.4 天；0.580</w:t>
             </w:r>
           </w:p>
         </w:tc>
@@ -963,18 +1185,38 @@
     </w:p>
     <w:p>
       <w:pPr>
-        <w:spacing w:after="100" w:line="285"/>
-        <w:jc w:val="both"/>
-      </w:pPr>
-      <w:r>
-        <w:rPr>
-          <w:rFonts w:ascii="Noto Serif CJK SC" w:cs="Noto Serif CJK SC" w:eastAsia="Noto Serif CJK SC" w:hAnsi="Noto Serif CJK SC"/>
-          <w:b w:val="false"/>
-          <w:bCs w:val="false"/>
-          <w:sz w:val="19"/>
-          <w:szCs w:val="19"/>
-        </w:rPr>
-        <w:t xml:space="preserve">区间几乎覆盖了整个取值范围。也就是说，colon 这个队列分不清「十次里有九次守住」和「一次都守不住」。0.270 和 0.497 是这两个数据集的性质，不是对方法在新队列里成功率的估计。而样本内评价连这两种变异都看不到。</w:t>
+        <w:spacing w:after="78" w:line="262"/>
+        <w:jc w:val="both"/>
+      </w:pPr>
+      <w:r>
+        <w:rPr>
+          <w:rFonts w:ascii="Noto Serif CJK SC" w:cs="Noto Serif CJK SC" w:eastAsia="Noto Serif CJK SC" w:hAnsi="Noto Serif CJK SC"/>
+          <w:b w:val="false"/>
+          <w:bCs w:val="false"/>
+          <w:sz w:val="19"/>
+          <w:szCs w:val="19"/>
+        </w:rPr>
+        <w:t xml:space="preserve">区间几乎覆盖了整个取值范围：colon 这个队列分不清「十次里有九次守住」和「一次都守不住」。0.290 和 0.522 是这两个数据集的性质，不是对方法成功率的估计；</w:t>
+      </w:r>
+      <w:r>
+        <w:rPr>
+          <w:rFonts w:ascii="Noto Sans CJK SC" w:cs="Noto Sans CJK SC" w:eastAsia="Noto Sans CJK SC" w:hAnsi="Noto Sans CJK SC"/>
+          <w:b/>
+          <w:bCs/>
+          <w:sz w:val="19"/>
+          <w:szCs w:val="19"/>
+        </w:rPr>
+        <w:t xml:space="preserve">用它们下「承诺没守住」的判断是过头的</w:t>
+      </w:r>
+      <w:r>
+        <w:rPr>
+          <w:rFonts w:ascii="Noto Serif CJK SC" w:cs="Noto Serif CJK SC" w:eastAsia="Noto Serif CJK SC" w:hAnsi="Noto Serif CJK SC"/>
+          <w:b w:val="false"/>
+          <w:bCs w:val="false"/>
+          <w:sz w:val="19"/>
+          <w:szCs w:val="19"/>
+        </w:rPr>
+        <w:t xml:space="preserve">，第四轮审稿在这点上是对的，全文已改。</w:t>
       </w:r>
     </w:p>
     <w:p>
@@ -989,12 +1231,12 @@
           <w:sz w:val="19"/>
           <w:szCs w:val="19"/>
         </w:rPr>
-        <w:t xml:space="preserve">3. 关键不是队列多大，也不是「集中不集中」，而是最强的稀释信号有多强</w:t>
-      </w:r>
-    </w:p>
-    <w:p>
-      <w:pPr>
-        <w:spacing w:after="100" w:line="285"/>
+        <w:t xml:space="preserve">3. 关键不是队列多大——但关键到底是什么，我们说不出来</w:t>
+      </w:r>
+    </w:p>
+    <w:p>
+      <w:pPr>
+        <w:spacing w:after="78" w:line="262"/>
         <w:jc w:val="both"/>
       </w:pPr>
       <w:r>
@@ -1050,7 +1292,7 @@
     </w:p>
     <w:p>
       <w:pPr>
-        <w:spacing w:after="100" w:line="285"/>
+        <w:spacing w:after="78" w:line="262"/>
         <w:jc w:val="both"/>
       </w:pPr>
       <w:r>
@@ -1086,63 +1328,99 @@
     </w:p>
     <w:p>
       <w:pPr>
-        <w:spacing w:after="100" w:line="285"/>
-        <w:jc w:val="both"/>
-      </w:pPr>
-      <w:r>
-        <w:rPr>
-          <w:rFonts w:ascii="Noto Serif CJK SC" w:cs="Noto Serif CJK SC" w:eastAsia="Noto Serif CJK SC" w:hAnsi="Noto Serif CJK SC"/>
-          <w:b w:val="false"/>
-          <w:bCs w:val="false"/>
-          <w:sz w:val="19"/>
-          <w:szCs w:val="19"/>
-        </w:rPr>
-        <w:t xml:space="preserve">我们另做一组模拟把两者拆开：总效应修饰固定为 0.85，只改分布方式。</w:t>
-      </w:r>
-      <w:r>
-        <w:rPr>
-          <w:rFonts w:ascii="Noto Sans CJK SC" w:cs="Noto Sans CJK SC" w:eastAsia="Noto Sans CJK SC" w:hAnsi="Noto Sans CJK SC"/>
-          <w:b/>
-          <w:bCs/>
-          <w:sz w:val="19"/>
-          <w:szCs w:val="19"/>
-        </w:rPr>
-        <w:t xml:space="preserve">把「富集」摊薄完全没关系</w:t>
-      </w:r>
-      <w:r>
-        <w:rPr>
-          <w:rFonts w:ascii="Noto Serif CJK SC" w:cs="Noto Serif CJK SC" w:eastAsia="Noto Serif CJK SC" w:hAnsi="Noto Serif CJK SC"/>
-          <w:b w:val="false"/>
-          <w:bCs w:val="false"/>
-          <w:sz w:val="19"/>
-          <w:szCs w:val="19"/>
-        </w:rPr>
-        <w:t xml:space="preserve">——稀释系数固定 0.30 时，在 600/2000/6000/18000 人处的成功概率，富集集中在一条是 0.26 / 0.37 / 0.58 / 0.85，摊到两条是 0.23 / 0.43 / 0.79 / 0.87，摊到四条是 0.17 / 0.39 / 0.78 / 0.95。</w:t>
-      </w:r>
-      <w:r>
-        <w:rPr>
-          <w:rFonts w:ascii="Noto Sans CJK SC" w:cs="Noto Sans CJK SC" w:eastAsia="Noto Sans CJK SC" w:hAnsi="Noto Sans CJK SC"/>
-          <w:b/>
-          <w:bCs/>
-          <w:sz w:val="19"/>
-          <w:szCs w:val="19"/>
-        </w:rPr>
-        <w:t xml:space="preserve">把「稀释」劈成两半才是致命的</w:t>
-      </w:r>
-      <w:r>
-        <w:rPr>
-          <w:rFonts w:ascii="Noto Serif CJK SC" w:cs="Noto Serif CJK SC" w:eastAsia="Noto Serif CJK SC" w:hAnsi="Noto Serif CJK SC"/>
-          <w:b w:val="false"/>
-          <w:bCs w:val="false"/>
-          <w:sz w:val="19"/>
-          <w:szCs w:val="19"/>
-        </w:rPr>
-        <w:t xml:space="preserve">：总量不变、稀释系数减半后变成 0.07 / 0.11 / 0.19 / 0.43。</w:t>
-      </w:r>
-    </w:p>
-    <w:p>
-      <w:pPr>
-        <w:spacing w:after="100" w:line="285"/>
+        <w:spacing w:after="78" w:line="262"/>
+        <w:jc w:val="both"/>
+      </w:pPr>
+      <w:r>
+        <w:rPr>
+          <w:rFonts w:ascii="Noto Serif CJK SC" w:cs="Noto Serif CJK SC" w:eastAsia="Noto Serif CJK SC" w:hAnsi="Noto Serif CJK SC"/>
+          <w:b w:val="false"/>
+          <w:bCs w:val="false"/>
+          <w:sz w:val="19"/>
+          <w:szCs w:val="19"/>
+        </w:rPr>
+        <w:t xml:space="preserve">我们另做一组模拟把两者拆开：总效应修饰固定为 0.85，只改分布方式。稀释系数固定 0.30 时，在 600/2000/6000/18000 人处的成功概率，富集集中在一条是 0.26 / 0.37 / 0.58 / 0.85，摊到两条是 0.23 / 0.43 / 0.79 / 0.87，摊到四条是 0.17 / 0.39 / 0.78 / 0.95；把总量不变的稀释劈成两半后变成 0.07 / 0.11 / 0.19 / 0.43。</w:t>
+      </w:r>
+    </w:p>
+    <w:p>
+      <w:pPr>
+        <w:spacing w:after="78" w:line="262"/>
+        <w:jc w:val="both"/>
+      </w:pPr>
+      <w:r>
+        <w:rPr>
+          <w:rFonts w:ascii="Noto Serif CJK SC" w:cs="Noto Serif CJK SC" w:eastAsia="Noto Serif CJK SC" w:hAnsi="Noto Serif CJK SC"/>
+          <w:b w:val="false"/>
+          <w:bCs w:val="false"/>
+          <w:sz w:val="19"/>
+          <w:szCs w:val="19"/>
+        </w:rPr>
+        <w:t xml:space="preserve">第三轮和第四轮又推翻了我们从这组数字里读出的两条结论。一是我们说「把富集摊薄没关系」，</w:t>
+      </w:r>
+      <w:r>
+        <w:rPr>
+          <w:rFonts w:ascii="Noto Sans CJK SC" w:cs="Noto Sans CJK SC" w:eastAsia="Noto Sans CJK SC" w:hAnsi="Noto Sans CJK SC"/>
+          <w:b/>
+          <w:bCs/>
+          <w:sz w:val="19"/>
+          <w:szCs w:val="19"/>
+        </w:rPr>
+        <w:t xml:space="preserve">加上蒙特卡洛区间之后它其实是有帮助的</w:t>
+      </w:r>
+      <w:r>
+        <w:rPr>
+          <w:rFonts w:ascii="Noto Serif CJK SC" w:cs="Noto Serif CJK SC" w:eastAsia="Noto Serif CJK SC" w:hAnsi="Noto Serif CJK SC"/>
+          <w:b w:val="false"/>
+          <w:bCs w:val="false"/>
+          <w:sz w:val="19"/>
+          <w:szCs w:val="19"/>
+        </w:rPr>
+        <w:t xml:space="preserve">：在 6000 人处提高了 0.21，区间 [0.08, 0.34]。二是我们说「决定数据量的是最强稀释系数的大小」，</w:t>
+      </w:r>
+      <w:r>
+        <w:rPr>
+          <w:rFonts w:ascii="Noto Sans CJK SC" w:cs="Noto Sans CJK SC" w:eastAsia="Noto Sans CJK SC" w:hAnsi="Noto Sans CJK SC"/>
+          <w:b/>
+          <w:bCs/>
+          <w:sz w:val="19"/>
+          <w:szCs w:val="19"/>
+        </w:rPr>
+        <w:t xml:space="preserve">这一条也撤回</w:t>
+      </w:r>
+      <w:r>
+        <w:rPr>
+          <w:rFonts w:ascii="Noto Serif CJK SC" w:cs="Noto Serif CJK SC" w:eastAsia="Noto Serif CJK SC" w:hAnsi="Noto Serif CJK SC"/>
+          <w:b w:val="false"/>
+          <w:bCs w:val="false"/>
+          <w:sz w:val="19"/>
+          <w:szCs w:val="19"/>
+        </w:rPr>
+        <w:t xml:space="preserve">：把稀释系数减半的同时，可达的改进幅度也差不多减半了（0.0203 → 0.0098），系数和「奖品」在这个设计里是绑在一起的，谁的功劳分不开。现在只保留更弱的说法：数据量要求取决于稀释信号相对于噪声的强度，而这个强度正是分析本身要估计的东西，所以无条件的门槛给不出来——和功效计算要先假定效应量是同一种处境。正文表 2 现已标注为</w:t>
+      </w:r>
+      <w:r>
+        <w:rPr>
+          <w:rFonts w:ascii="Noto Sans CJK SC" w:cs="Noto Sans CJK SC" w:eastAsia="Noto Sans CJK SC" w:hAnsi="Noto Sans CJK SC"/>
+          <w:b/>
+          <w:bCs/>
+          <w:sz w:val="19"/>
+          <w:szCs w:val="19"/>
+        </w:rPr>
+        <w:t xml:space="preserve">敏感性分析</w:t>
+      </w:r>
+      <w:r>
+        <w:rPr>
+          <w:rFonts w:ascii="Noto Serif CJK SC" w:cs="Noto Serif CJK SC" w:eastAsia="Noto Serif CJK SC" w:hAnsi="Noto Serif CJK SC"/>
+          <w:b w:val="false"/>
+          <w:bCs w:val="false"/>
+          <w:sz w:val="19"/>
+          <w:szCs w:val="19"/>
+        </w:rPr>
+        <w:t xml:space="preserve">，不再当作可以读出样本量要求的设计曲线。我们试过的最有希望的候选量是「标准特异的信噪比」（最强稀释标准的总体 Shapley 值除以它在该拟合规模下估计的标准差）：在 12 个模拟格子上它对成功率的排序（Spearman 0.86）好于单纯的样本量（0.45）。但 12 个格子不足以确立一个决定性的量，而且信噪比本身就随样本量上升、两者在设计上相关，所以只作为方向报告。</w:t>
+      </w:r>
+    </w:p>
+    <w:p>
+      <w:pPr>
+        <w:spacing w:after="78" w:line="262"/>
         <w:jc w:val="both"/>
       </w:pPr>
       <w:r>
@@ -1193,7 +1471,7 @@
     </w:p>
     <w:p>
       <w:pPr>
-        <w:spacing w:after="100" w:line="285"/>
+        <w:spacing w:after="78" w:line="262"/>
         <w:jc w:val="both"/>
       </w:pPr>
       <w:r>
@@ -1264,7 +1542,7 @@
     </w:p>
     <w:p>
       <w:pPr>
-        <w:spacing w:after="100" w:line="285"/>
+        <w:spacing w:after="78" w:line="262"/>
         <w:jc w:val="both"/>
       </w:pPr>
       <w:r>
@@ -1300,7 +1578,7 @@
     </w:p>
     <w:p>
       <w:pPr>
-        <w:spacing w:after="100" w:line="285"/>
+        <w:spacing w:after="78" w:line="262"/>
         <w:jc w:val="both"/>
       </w:pPr>
       <w:r>
@@ -1316,7 +1594,7 @@
     </w:p>
     <w:p>
       <w:pPr>
-        <w:spacing w:after="90" w:before="200"/>
+        <w:spacing w:after="78" w:before="170"/>
       </w:pPr>
       <w:r>
         <w:rPr>
@@ -1327,12 +1605,12 @@
           <w:sz w:val="21"/>
           <w:szCs w:val="21"/>
         </w:rPr>
-        <w:t xml:space="preserve">五、两轮审稿指出的错误</w:t>
-      </w:r>
-    </w:p>
-    <w:p>
-      <w:pPr>
-        <w:spacing w:after="70" w:line="285"/>
+        <w:t xml:space="preserve">五、四轮审稿指出的错误</w:t>
+      </w:r>
+    </w:p>
+    <w:p>
+      <w:pPr>
+        <w:spacing w:after="60" w:line="268"/>
         <w:ind w:left="300" w:hanging="300"/>
         <w:jc w:val="both"/>
       </w:pPr>
@@ -1355,32 +1633,32 @@
           <w:sz w:val="19"/>
           <w:szCs w:val="19"/>
         </w:rPr>
-        <w:t xml:space="preserve">我们原稿说 Shapley 效率公理在风险比尺度上只近似成立。</w:t>
-      </w:r>
-      <w:r>
-        <w:rPr>
-          <w:rFonts w:ascii="Noto Sans CJK SC" w:cs="Noto Sans CJK SC" w:eastAsia="Noto Sans CJK SC" w:hAnsi="Noto Sans CJK SC"/>
-          <w:b/>
-          <w:bCs/>
-          <w:sz w:val="19"/>
-          <w:szCs w:val="19"/>
-        </w:rPr>
-        <w:t xml:space="preserve">这一点不成立</w:t>
-      </w:r>
-      <w:r>
-        <w:rPr>
-          <w:rFonts w:ascii="Noto Serif CJK SC" w:cs="Noto Serif CJK SC" w:eastAsia="Noto Serif CJK SC" w:hAnsi="Noto Serif CJK SC"/>
-          <w:b w:val="false"/>
-          <w:bCs w:val="false"/>
-          <w:sz w:val="19"/>
-          <w:szCs w:val="19"/>
-        </w:rPr>
-        <w:t xml:space="preserve">：穷举枚举下任何尺度都精确成立（验证到 2.2e-16 和 8.3e-17）。尺度决定的是「分解的是哪个总量」——比值的对数还是比值之差——这是解释性理由，不是公理性理由。</w:t>
-      </w:r>
-    </w:p>
-    <w:p>
-      <w:pPr>
-        <w:spacing w:after="70" w:line="285"/>
+        <w:t xml:space="preserve">原稿说 Shapley 效率公理在风险比尺度上只近似成立，</w:t>
+      </w:r>
+      <w:r>
+        <w:rPr>
+          <w:rFonts w:ascii="Noto Sans CJK SC" w:cs="Noto Sans CJK SC" w:eastAsia="Noto Sans CJK SC" w:hAnsi="Noto Sans CJK SC"/>
+          <w:b/>
+          <w:bCs/>
+          <w:sz w:val="19"/>
+          <w:szCs w:val="19"/>
+        </w:rPr>
+        <w:t xml:space="preserve">不成立</w:t>
+      </w:r>
+      <w:r>
+        <w:rPr>
+          <w:rFonts w:ascii="Noto Serif CJK SC" w:cs="Noto Serif CJK SC" w:eastAsia="Noto Serif CJK SC" w:hAnsi="Noto Serif CJK SC"/>
+          <w:b w:val="false"/>
+          <w:bCs w:val="false"/>
+          <w:sz w:val="19"/>
+          <w:szCs w:val="19"/>
+        </w:rPr>
+        <w:t xml:space="preserve">：穷举枚举下任何尺度都精确成立（验证到 2.2e-16 和 8.3e-17）。尺度决定的只是分解哪个总量。</w:t>
+      </w:r>
+    </w:p>
+    <w:p>
+      <w:pPr>
+        <w:spacing w:after="60" w:line="268"/>
         <w:ind w:left="300" w:hanging="300"/>
         <w:jc w:val="both"/>
       </w:pPr>
@@ -1403,12 +1681,12 @@
           <w:sz w:val="19"/>
           <w:szCs w:val="19"/>
         </w:rPr>
-        <w:t xml:space="preserve">「多纳入病人」被我们当成一条经过验证的收益来写，其实是构造性的（见发现 1）。已全文改写，并补上随机放宽对照。</w:t>
-      </w:r>
-    </w:p>
-    <w:p>
-      <w:pPr>
-        <w:spacing w:after="70" w:line="285"/>
+        <w:t xml:space="preserve">「多纳入病人」被当成经过验证的收益来写，其实是构造性的（见发现 1）。已全文改写并补上随机放宽对照。</w:t>
+      </w:r>
+    </w:p>
+    <w:p>
+      <w:pPr>
+        <w:spacing w:after="60" w:line="268"/>
         <w:ind w:left="300" w:hanging="300"/>
         <w:jc w:val="both"/>
       </w:pPr>
@@ -1431,7 +1709,7 @@
           <w:sz w:val="19"/>
           <w:szCs w:val="19"/>
         </w:rPr>
-        <w:t xml:space="preserve">审稿人要求补倾向性细节，查下来发现 Rotterdam 在完整方案内存在</w:t>
+        <w:t xml:space="preserve">Rotterdam 在完整方案内存在</w:t>
       </w:r>
       <w:r>
         <w:rPr>
@@ -1451,12 +1729,12 @@
           <w:sz w:val="19"/>
           <w:szCs w:val="19"/>
         </w:rPr>
-        <w:t xml:space="preserve">：419 人里 132 个倾向值顶在截断边界，8 个协变量有 6 个加权后仍失衡，加权有效样本量只有名义的 37%。原因是化疗几乎只给了年轻绝经前女性——55 到 70 岁的 116 人里只有 12 人接受化疗。加样条只会更差。该队列的风险比现在按描述性报告，因果解读只靠随机化队列和模拟。</w:t>
-      </w:r>
-    </w:p>
-    <w:p>
-      <w:pPr>
-        <w:spacing w:after="70" w:line="285"/>
+        <w:t xml:space="preserve">：419 人里 132 个倾向值顶在截断边界，加权有效样本量只有名义的 37%；化疗几乎只给了年轻绝经前女性。该队列现在全部按描述性报告，因果解读只靠随机化队列和模拟。</w:t>
+      </w:r>
+    </w:p>
+    <w:p>
+      <w:pPr>
+        <w:spacing w:after="60" w:line="268"/>
         <w:ind w:left="300" w:hanging="300"/>
         <w:jc w:val="both"/>
       </w:pPr>
@@ -1479,12 +1757,12 @@
           <w:sz w:val="19"/>
           <w:szCs w:val="19"/>
         </w:rPr>
-        <w:t xml:space="preserve">第二轮：嵌套自助有泄漏——自助样本里同一病人的副本可能落到划分两侧。已按病人 ID 划分并加了断言，重算后区间变窄。</w:t>
-      </w:r>
-    </w:p>
-    <w:p>
-      <w:pPr>
-        <w:spacing w:after="70" w:line="285"/>
+        <w:t xml:space="preserve">第二轮：嵌套自助有泄漏——自助样本里同一病人的副本可能落到划分两侧。已按病人 ID 划分并加断言，重算后区间变窄。</w:t>
+      </w:r>
+    </w:p>
+    <w:p>
+      <w:pPr>
+        <w:spacing w:after="60" w:line="268"/>
         <w:ind w:left="300" w:hanging="300"/>
         <w:jc w:val="both"/>
       </w:pPr>
@@ -1507,7 +1785,7 @@
           <w:sz w:val="19"/>
           <w:szCs w:val="19"/>
         </w:rPr>
-        <w:t xml:space="preserve">第二轮：只用「能观察到阈值」的 6 个情景算离散度，有选择偏倚；据此得出的「事件数比人数更不稳」</w:t>
+        <w:t xml:space="preserve">第二轮：只用「能观察到阈值」的 6 个情景算离散度有选择偏倚，据此得出的「事件数比人数更不稳」</w:t>
       </w:r>
       <w:r>
         <w:rPr>
@@ -1532,7 +1810,7 @@
     </w:p>
     <w:p>
       <w:pPr>
-        <w:spacing w:after="70" w:line="285"/>
+        <w:spacing w:after="60" w:line="268"/>
         <w:ind w:left="300" w:hanging="300"/>
         <w:jc w:val="both"/>
       </w:pPr>
@@ -1575,7 +1853,7 @@
           <w:sz w:val="19"/>
           <w:szCs w:val="19"/>
         </w:rPr>
-        <w:t xml:space="preserve">。数字本身就说明：RMST 差从全队列的 0.664 降到子群的 0.599（最弱设定）、0.425 降到 0.322（最强设定）。低风险人群绝对获益</w:t>
+        <w:t xml:space="preserve">——RMST 差 0.664→0.599、0.425→0.322，低风险人群绝对获益</w:t>
       </w:r>
       <w:r>
         <w:rPr>
@@ -1595,12 +1873,136 @@
           <w:sz w:val="19"/>
           <w:szCs w:val="19"/>
         </w:rPr>
-        <w:t xml:space="preserve">，因为他们本来就活得过截断时间。</w:t>
-      </w:r>
-    </w:p>
-    <w:p>
-      <w:pPr>
-        <w:spacing w:after="90" w:before="200"/>
+        <w:t xml:space="preserve">。</w:t>
+      </w:r>
+    </w:p>
+    <w:p>
+      <w:pPr>
+        <w:spacing w:after="60" w:line="268"/>
+        <w:ind w:left="300" w:hanging="300"/>
+        <w:jc w:val="both"/>
+      </w:pPr>
+      <w:r>
+        <w:rPr>
+          <w:rFonts w:ascii="Noto Sans CJK SC" w:cs="Noto Sans CJK SC" w:eastAsia="Noto Sans CJK SC" w:hAnsi="Noto Sans CJK SC"/>
+          <w:b/>
+          <w:bCs/>
+          <w:color w:val="1A4B7A"/>
+          <w:sz w:val="19"/>
+          <w:szCs w:val="19"/>
+        </w:rPr>
+        <w:t xml:space="preserve">错误六  </w:t>
+      </w:r>
+      <w:r>
+        <w:rPr>
+          <w:rFonts w:ascii="Noto Serif CJK SC" w:cs="Noto Serif CJK SC" w:eastAsia="Noto Serif CJK SC" w:hAnsi="Noto Serif CJK SC"/>
+          <w:b w:val="false"/>
+          <w:bCs w:val="false"/>
+          <w:sz w:val="19"/>
+          <w:szCs w:val="19"/>
+        </w:rPr>
+        <w:t xml:space="preserve">第三轮：我们写「把富集摊薄没关系」，其实是有帮助的（+0.21，区间 [0.08, 0.34]），已改。同一节里「稀释系数是决定性的量」也撤回，因为系数和可达改进幅度在设计上是绑定的。</w:t>
+      </w:r>
+    </w:p>
+    <w:p>
+      <w:pPr>
+        <w:spacing w:after="60" w:line="268"/>
+        <w:ind w:left="300" w:hanging="300"/>
+        <w:jc w:val="both"/>
+      </w:pPr>
+      <w:r>
+        <w:rPr>
+          <w:rFonts w:ascii="Noto Sans CJK SC" w:cs="Noto Sans CJK SC" w:eastAsia="Noto Sans CJK SC" w:hAnsi="Noto Sans CJK SC"/>
+          <w:b/>
+          <w:bCs/>
+          <w:color w:val="1A4B7A"/>
+          <w:sz w:val="19"/>
+          <w:szCs w:val="19"/>
+        </w:rPr>
+        <w:t xml:space="preserve">错误七（最严重）  </w:t>
+      </w:r>
+      <w:r>
+        <w:rPr>
+          <w:rFonts w:ascii="Noto Serif CJK SC" w:cs="Noto Serif CJK SC" w:eastAsia="Noto Serif CJK SC" w:hAnsi="Noto Serif CJK SC"/>
+          <w:b w:val="false"/>
+          <w:bCs w:val="false"/>
+          <w:sz w:val="19"/>
+          <w:szCs w:val="19"/>
+        </w:rPr>
+        <w:t xml:space="preserve">第四轮：审稿人指出正文和补充材料对同一个量给出不同的数，我们上一轮把它解释成蒙特卡洛噪声。查下来真正的原因要糟得多——第二、三轮新增的 </w:t>
+      </w:r>
+      <w:r>
+        <w:rPr>
+          <w:rFonts w:ascii="Noto Sans CJK SC" w:cs="Noto Sans CJK SC" w:eastAsia="Noto Sans CJK SC" w:hAnsi="Noto Sans CJK SC"/>
+          <w:b/>
+          <w:bCs/>
+          <w:sz w:val="19"/>
+          <w:szCs w:val="19"/>
+        </w:rPr>
+        <w:t xml:space="preserve">11 个脚本把 Rotterdam 的终点写成了「无复发生存时间 + 死亡指示」在 1825 天截断</w:t>
+      </w:r>
+      <w:r>
+        <w:rPr>
+          <w:rFonts w:ascii="Noto Serif CJK SC" w:cs="Noto Serif CJK SC" w:eastAsia="Noto Serif CJK SC" w:hAnsi="Noto Serif CJK SC"/>
+          <w:b w:val="false"/>
+          <w:bCs w:val="false"/>
+          <w:sz w:val="19"/>
+          <w:szCs w:val="19"/>
+        </w:rPr>
+        <w:t xml:space="preserve">，而表 1 用的是正确的「死亡时间 + 死亡指示」在 2555 天截断。时间和事件指示不配对，会把事件时间系统性地缩短。这不是两次运行的差异，是两个不同的终点。已全部改正并重算。</w:t>
+      </w:r>
+    </w:p>
+    <w:p>
+      <w:pPr>
+        <w:spacing w:after="60" w:line="268"/>
+        <w:ind w:left="300" w:hanging="300"/>
+        <w:jc w:val="both"/>
+      </w:pPr>
+      <w:r>
+        <w:rPr>
+          <w:rFonts w:ascii="Noto Sans CJK SC" w:cs="Noto Sans CJK SC" w:eastAsia="Noto Sans CJK SC" w:hAnsi="Noto Sans CJK SC"/>
+          <w:b/>
+          <w:bCs/>
+          <w:color w:val="1A4B7A"/>
+          <w:sz w:val="19"/>
+          <w:szCs w:val="19"/>
+        </w:rPr>
+        <w:t xml:space="preserve">结构性补救  </w:t>
+      </w:r>
+      <w:r>
+        <w:rPr>
+          <w:rFonts w:ascii="Noto Serif CJK SC" w:cs="Noto Serif CJK SC" w:eastAsia="Noto Serif CJK SC" w:hAnsi="Noto Serif CJK SC"/>
+          <w:b w:val="false"/>
+          <w:bCs w:val="false"/>
+          <w:sz w:val="19"/>
+          <w:szCs w:val="19"/>
+        </w:rPr>
+        <w:t xml:space="preserve">现在所有真实队列的点估计都由</w:t>
+      </w:r>
+      <w:r>
+        <w:rPr>
+          <w:rFonts w:ascii="Noto Sans CJK SC" w:cs="Noto Sans CJK SC" w:eastAsia="Noto Sans CJK SC" w:hAnsi="Noto Sans CJK SC"/>
+          <w:b/>
+          <w:bCs/>
+          <w:sz w:val="19"/>
+          <w:szCs w:val="19"/>
+        </w:rPr>
+        <w:t xml:space="preserve">一个脚本 analysis/primary.R 一次算出</w:t>
+      </w:r>
+      <w:r>
+        <w:rPr>
+          <w:rFonts w:ascii="Noto Serif CJK SC" w:cs="Noto Serif CJK SC" w:eastAsia="Noto Serif CJK SC" w:hAnsi="Noto Serif CJK SC"/>
+          <w:b w:val="false"/>
+          <w:bCs w:val="false"/>
+          <w:sz w:val="19"/>
+          <w:szCs w:val="19"/>
+        </w:rPr>
+        <w:t xml:space="preserve">并写进同一个结果文件，摘要、正文、表 1、补充材料全部从它读数，没有一处手抄；嵌套自助只负责不确定性。导出时有三条断言（终点配对、截断时间、两套估计的一致性），违反即中止构建。</w:t>
+      </w:r>
+    </w:p>
+    <w:p>
+      <w:pPr>
+        <w:spacing w:after="78" w:before="170"/>
       </w:pPr>
       <w:r>
         <w:rPr>
@@ -1616,7 +2018,7 @@
     </w:p>
     <w:p>
       <w:pPr>
-        <w:spacing w:after="70" w:line="285"/>
+        <w:spacing w:after="60" w:line="268"/>
         <w:ind w:left="300" w:hanging="300"/>
         <w:jc w:val="both"/>
       </w:pPr>
@@ -1639,32 +2041,32 @@
           <w:sz w:val="19"/>
           <w:szCs w:val="19"/>
         </w:rPr>
-        <w:t xml:space="preserve">闭式量 L = 1 − p(ij)/p(i) − p(ij)/p(j) + p(ij)，只用入组率、不用任何结局数据。原稿把「杠杆低」说成「结构上测不出」，</w:t>
-      </w:r>
-      <w:r>
-        <w:rPr>
-          <w:rFonts w:ascii="Noto Sans CJK SC" w:cs="Noto Sans CJK SC" w:eastAsia="Noto Sans CJK SC" w:hAnsi="Noto Sans CJK SC"/>
-          <w:b/>
-          <w:bCs/>
-          <w:sz w:val="19"/>
-          <w:szCs w:val="19"/>
-        </w:rPr>
-        <w:t xml:space="preserve">这个说法不够准确</w:t>
-      </w:r>
-      <w:r>
-        <w:rPr>
-          <w:rFonts w:ascii="Noto Serif CJK SC" w:cs="Noto Serif CJK SC" w:eastAsia="Noto Serif CJK SC" w:hAnsi="Noto Serif CJK SC"/>
-          <w:b w:val="false"/>
-          <w:bCs w:val="false"/>
-          <w:sz w:val="19"/>
-          <w:szCs w:val="19"/>
-        </w:rPr>
-        <w:t xml:space="preserve">：它是按一个已知因子的衰减，衰减后的信号仍然取决于效应大小和样本量。真正「结构上测不出」的只有逻辑蕴含（四点差恰为零）。我们另外推导了两种交互形式的系数，在独立标准下分别是 (1−q)²、−(1−q)² 和 −2(1−q)²——都是同一个量的倍数。</w:t>
-      </w:r>
-    </w:p>
-    <w:p>
-      <w:pPr>
-        <w:spacing w:after="70" w:line="285"/>
+        <w:t xml:space="preserve">闭式量 L = 1 − p(ij)/p(i) − p(ij)/p(j) + p(ij)，只用入组率、不用结局数据。原稿把「杠杆低」说成「结构上测不出」</w:t>
+      </w:r>
+      <w:r>
+        <w:rPr>
+          <w:rFonts w:ascii="Noto Sans CJK SC" w:cs="Noto Sans CJK SC" w:eastAsia="Noto Sans CJK SC" w:hAnsi="Noto Sans CJK SC"/>
+          <w:b/>
+          <w:bCs/>
+          <w:sz w:val="19"/>
+          <w:szCs w:val="19"/>
+        </w:rPr>
+        <w:t xml:space="preserve">不够准确</w:t>
+      </w:r>
+      <w:r>
+        <w:rPr>
+          <w:rFonts w:ascii="Noto Serif CJK SC" w:cs="Noto Serif CJK SC" w:eastAsia="Noto Serif CJK SC" w:hAnsi="Noto Serif CJK SC"/>
+          <w:b w:val="false"/>
+          <w:bCs w:val="false"/>
+          <w:sz w:val="19"/>
+          <w:szCs w:val="19"/>
+        </w:rPr>
+        <w:t xml:space="preserve">：它是按已知因子的衰减，信号仍取决于效应大小和样本量。真正测不出的只有逻辑蕴含。AND/OR/XOR 三种形式的系数分别是 (1−q)²、−(1−q)²、−2(1−q)²。</w:t>
+      </w:r>
+    </w:p>
+    <w:p>
+      <w:pPr>
+        <w:spacing w:after="60" w:line="268"/>
         <w:ind w:left="300" w:hanging="300"/>
         <w:jc w:val="both"/>
       </w:pPr>
@@ -1687,12 +2089,12 @@
           <w:sz w:val="19"/>
           <w:szCs w:val="19"/>
         </w:rPr>
-        <w:t xml:space="preserve">若标准 i 逻辑上蕴含 j，这对的交互是算术恒等式，必须从检验族里剔除。这是唯一无论样本量多大都无信息的一类格子。</w:t>
-      </w:r>
-    </w:p>
-    <w:p>
-      <w:pPr>
-        <w:spacing w:after="70" w:line="285"/>
+        <w:t xml:space="preserve">若标准 i 逻辑上蕴含 j，这对的交互是算术恒等式，是唯一无论样本量多大都无信息的格子，必须从检验族里剔除。</w:t>
+      </w:r>
+    </w:p>
+    <w:p>
+      <w:pPr>
+        <w:spacing w:after="60" w:line="268"/>
         <w:ind w:left="300" w:hanging="300"/>
         <w:jc w:val="both"/>
       </w:pPr>
@@ -1715,12 +2117,12 @@
           <w:sz w:val="19"/>
           <w:szCs w:val="19"/>
         </w:rPr>
-        <w:t xml:space="preserve">同时报告风险比和 RMST 差。在条件风险比固定为 0.6（每个亚组都一样）的模拟里，一条标准没改变任何人的相对获益，它在对数风险比上的 Shapley 值却随预后异质性从 −0.0008 长到 −0.066，边际风险比从 0.599 漂到 0.804；异质性为零时假象消失，这是证伪点。RMST 差的移动则是真实的。</w:t>
-      </w:r>
-    </w:p>
-    <w:p>
-      <w:pPr>
-        <w:spacing w:after="90" w:before="200"/>
+        <w:t xml:space="preserve">同时报告风险比和 RMST 差。条件风险比固定为 0.6 的模拟里，一条标准没改变任何人的相对获益，它在对数风险比上的 Shapley 值却随预后异质性从 −0.0008 长到 −0.066；异质性为零时假象消失。RMST 差的移动则是真实的。</w:t>
+      </w:r>
+    </w:p>
+    <w:p>
+      <w:pPr>
+        <w:spacing w:after="78" w:before="170"/>
       </w:pPr>
       <w:r>
         <w:rPr>
@@ -1736,23 +2138,43 @@
     </w:p>
     <w:p>
       <w:pPr>
-        <w:spacing w:after="100" w:line="285"/>
-        <w:jc w:val="both"/>
-      </w:pPr>
-      <w:r>
-        <w:rPr>
-          <w:rFonts w:ascii="Noto Serif CJK SC" w:cs="Noto Serif CJK SC" w:eastAsia="Noto Serif CJK SC" w:hAnsi="Noto Serif CJK SC"/>
-          <w:b w:val="false"/>
-          <w:bCs w:val="false"/>
-          <w:sz w:val="19"/>
-          <w:szCs w:val="19"/>
-        </w:rPr>
-        <w:t xml:space="preserve">它不是在说 Trial Pathfinder 错了。原文的做法在它自己的数据规模上有其道理，我们复制出来的规则在总体层面确实收敛到最优标准集。我们做的是：把两个被捆绑报告的承诺拆开，指出其中一个是构造性的、另一个有严苛的前提条件；给出那个前提到底取决于什么（效应修饰是否集中，而不是队列多大）；并指出低于阈值时代价是负的。同时提供三个动手前就能算的诊断量，让研究者先判断自己的队列能支撑哪一个结论。</w:t>
-      </w:r>
-    </w:p>
-    <w:p>
-      <w:pPr>
-        <w:spacing w:after="90" w:before="200"/>
+        <w:spacing w:after="78" w:line="262"/>
+        <w:jc w:val="both"/>
+      </w:pPr>
+      <w:r>
+        <w:rPr>
+          <w:rFonts w:ascii="Noto Serif CJK SC" w:cs="Noto Serif CJK SC" w:eastAsia="Noto Serif CJK SC" w:hAnsi="Noto Serif CJK SC"/>
+          <w:b w:val="false"/>
+          <w:bCs w:val="false"/>
+          <w:sz w:val="19"/>
+          <w:szCs w:val="19"/>
+        </w:rPr>
+        <w:t xml:space="preserve">它不是在说 Trial Pathfinder 错了。原文的做法在它自己的数据规模上有其道理，我们复制出来的规则在总体层面确实收敛到最优标准集。我们做的是：把两个被捆绑报告的承诺拆开，指出一个是构造性的、另一个的成立与否</w:t>
+      </w:r>
+      <w:r>
+        <w:rPr>
+          <w:rFonts w:ascii="Noto Sans CJK SC" w:cs="Noto Sans CJK SC" w:eastAsia="Noto Sans CJK SC" w:hAnsi="Noto Sans CJK SC"/>
+          <w:b/>
+          <w:bCs/>
+          <w:sz w:val="19"/>
+          <w:szCs w:val="19"/>
+        </w:rPr>
+        <w:t xml:space="preserve">这个规模的公开队列判不出来</w:t>
+      </w:r>
+      <w:r>
+        <w:rPr>
+          <w:rFonts w:ascii="Noto Serif CJK SC" w:cs="Noto Serif CJK SC" w:eastAsia="Noto Serif CJK SC" w:hAnsi="Noto Serif CJK SC"/>
+          <w:b w:val="false"/>
+          <w:bCs w:val="false"/>
+          <w:sz w:val="19"/>
+          <w:szCs w:val="19"/>
+        </w:rPr>
+        <w:t xml:space="preserve">；说明数据量要求为什么不能无条件地给；并提供三个动手前就能算的诊断量。</w:t>
+      </w:r>
+    </w:p>
+    <w:p>
+      <w:pPr>
+        <w:spacing w:after="78" w:before="170"/>
       </w:pPr>
       <w:r>
         <w:rPr>
@@ -1783,18 +2205,38 @@
     </w:p>
     <w:p>
       <w:pPr>
-        <w:spacing w:after="100" w:line="285"/>
-        <w:jc w:val="both"/>
-      </w:pPr>
-      <w:r>
-        <w:rPr>
-          <w:rFonts w:ascii="Noto Serif CJK SC" w:cs="Noto Serif CJK SC" w:eastAsia="Noto Serif CJK SC" w:hAnsi="Noto Serif CJK SC"/>
-          <w:b w:val="false"/>
-          <w:bCs w:val="false"/>
-          <w:sz w:val="19"/>
-          <w:szCs w:val="19"/>
-        </w:rPr>
-        <w:t xml:space="preserve">因为入组人数通常不是唯一目的。随机放宽确实能多招人，但招进来的人群里疗效估计会更差（colon 平均风险比 0.686 vs 规则的 0.663，Rotterdam 0.805 vs 0.718）。规则换来的是估计质量，代价是比它能做到的少招一些人。我们认为这个取舍值得明确报告，而只跟完整方案比时它不会显现出来。</w:t>
+        <w:spacing w:after="78" w:line="262"/>
+        <w:jc w:val="both"/>
+      </w:pPr>
+      <w:r>
+        <w:rPr>
+          <w:rFonts w:ascii="Noto Serif CJK SC" w:cs="Noto Serif CJK SC" w:eastAsia="Noto Serif CJK SC" w:hAnsi="Noto Serif CJK SC"/>
+          <w:b w:val="false"/>
+          <w:bCs w:val="false"/>
+          <w:sz w:val="19"/>
+          <w:szCs w:val="19"/>
+        </w:rPr>
+        <w:t xml:space="preserve">因为入组人数通常不是唯一目的。随机放宽确实能多招人，但招进来的人群里疗效估计会更差（colon 平均风险比 0.686 vs 规则的 0.663，Rotterdam 0.805 vs 0.718）。规则换来的可能是估计质量，代价是比它能做到的少招一些人。需要说清楚的是：在</w:t>
+      </w:r>
+      <w:r>
+        <w:rPr>
+          <w:rFonts w:ascii="Noto Sans CJK SC" w:cs="Noto Sans CJK SC" w:eastAsia="Noto Sans CJK SC" w:hAnsi="Noto Sans CJK SC"/>
+          <w:b/>
+          <w:bCs/>
+          <w:sz w:val="19"/>
+          <w:szCs w:val="19"/>
+        </w:rPr>
+        <w:t xml:space="preserve">相同入组人数</w:t>
+      </w:r>
+      <w:r>
+        <w:rPr>
+          <w:rFonts w:ascii="Noto Serif CJK SC" w:cs="Noto Serif CJK SC" w:eastAsia="Noto Serif CJK SC" w:hAnsi="Noto Serif CJK SC"/>
+          <w:b w:val="false"/>
+          <w:bCs w:val="false"/>
+          <w:sz w:val="19"/>
+          <w:szCs w:val="19"/>
+        </w:rPr>
+        <w:t xml:space="preserve">下它是否仍有这个优势，这两个队列的规模判不出来（区间都包含 0.5）。我们认为这个取舍值得明确报告，而只跟完整方案比时它不会显现出来。</w:t>
       </w:r>
     </w:p>
     <w:p>
@@ -1814,18 +2256,18 @@
     </w:p>
     <w:p>
       <w:pPr>
-        <w:spacing w:after="100" w:line="285"/>
-        <w:jc w:val="both"/>
-      </w:pPr>
-      <w:r>
-        <w:rPr>
-          <w:rFonts w:ascii="Noto Serif CJK SC" w:cs="Noto Serif CJK SC" w:eastAsia="Noto Serif CJK SC" w:hAnsi="Noto Serif CJK SC"/>
-          <w:b w:val="false"/>
-          <w:bCs w:val="false"/>
-          <w:sz w:val="19"/>
-          <w:szCs w:val="19"/>
-        </w:rPr>
-        <w:t xml:space="preserve">四步。第一，先把出于安全性、耐受性、给药可行性、药理考虑的标准标记为</w:t>
+        <w:spacing w:after="78" w:line="262"/>
+        <w:jc w:val="both"/>
+      </w:pPr>
+      <w:r>
+        <w:rPr>
+          <w:rFonts w:ascii="Noto Serif CJK SC" w:cs="Noto Serif CJK SC" w:eastAsia="Noto Serif CJK SC" w:hAnsi="Noto Serif CJK SC"/>
+          <w:b w:val="false"/>
+          <w:bCs w:val="false"/>
+          <w:sz w:val="19"/>
+          <w:szCs w:val="19"/>
+        </w:rPr>
+        <w:t xml:space="preserve">四步。（1）先把出于安全性、耐受性、给药可行性、药理考虑的标准标记为</w:t>
       </w:r>
       <w:r>
         <w:rPr>
@@ -1845,12 +2287,12 @@
           <w:sz w:val="19"/>
           <w:szCs w:val="19"/>
         </w:rPr>
-        <w:t xml:space="preserve">，这些不该交给风险比来裁决。第二，在看任何结局之前算交互杠杆和逻辑蕴含。第三，检查完整方案内部的正性/重叠情况——这是最严格的那个人群，最容易出问题。第四，判断自己的方案里有没有一条标准集中了足够差异获益；如果没有，就只报告人群扩大，不要报告疗效改善。</w:t>
+        <w:t xml:space="preserve">。（2）看结局之前先算交互杠杆和逻辑蕴含。（3）检查完整方案内部的正性/重叠。（4）判断方案里有没有一条标准集中了足够差异获益；没有的话，就只报告人群扩大，不报告疗效改善。</w:t>
       </w:r>
     </w:p>
     <w:sectPr>
       <w:pgSz w:w="12240" w:h="15840" w:orient="portrait"/>
-      <w:pgMar w:top="950" w:right="1100" w:bottom="950" w:left="1100" w:header="708" w:footer="708" w:gutter="0"/>
+      <w:pgMar w:top="760" w:right="1000" w:bottom="720" w:left="1000" w:header="708" w:footer="708" w:gutter="0"/>
       <w:pgNumType/>
       <w:docGrid w:linePitch="360"/>
     </w:sectPr>

</xml_diff>

<commit_message>
Fifth revision: enforce the single-source claim with a build guard, and fix what it found
</commit_message>
<xml_diff>
--- a/explainer/文章解读_中文.docx
+++ b/explainer/文章解读_中文.docx
@@ -569,7 +569,27 @@
           <w:sz w:val="19"/>
           <w:szCs w:val="19"/>
         </w:rPr>
-        <w:t xml:space="preserve">（一份拟合、一份挑支配者、一份完全没用过的做检验）：colon 中位 77 个表面支配者里，只有 35.3% 在没用过的那份上仍然支配；不过规则落在前沿上的比例本身变化不大（2.5% → 4.3%）。所以现在的说法是：规则离</w:t>
+        <w:t xml:space="preserve">。第五轮审稿要求把三个量分开：(a) 挑选那一份上的支配者，是乐观的经验量；(b) </w:t>
+      </w:r>
+      <w:r>
+        <w:rPr>
+          <w:rFonts w:ascii="Noto Sans CJK SC" w:cs="Noto Sans CJK SC" w:eastAsia="Noto Sans CJK SC" w:hAnsi="Noto Sans CJK SC"/>
+          <w:b/>
+          <w:bCs/>
+          <w:sz w:val="19"/>
+          <w:szCs w:val="19"/>
+        </w:rPr>
+        <w:t xml:space="preserve">把这些预先选定的子集拿到没用过的那一份上重新评价，这是唯一的确证量</w:t>
+      </w:r>
+      <w:r>
+        <w:rPr>
+          <w:rFonts w:ascii="Noto Serif CJK SC" w:cs="Noto Serif CJK SC" w:eastAsia="Noto Serif CJK SC" w:hAnsi="Noto Serif CJK SC"/>
+          <w:b w:val="false"/>
+          <w:bCs w:val="false"/>
+          <w:sz w:val="19"/>
+          <w:szCs w:val="19"/>
+        </w:rPr>
+        <w:t xml:space="preserve">——colon 只有 35.3% 仍然支配，规则未被任何预选子集支配的比例是 21.0%（Rotterdam 12.0%），比经验口径的 3.0%／1.0% 高好几倍；(c) 在检验那一份上重新扫描全部 512 个子集，仍然是经验最优，只作描述。方向不变（大多数划分里规则仍被支配），但只报 (a) 会把差距夸大。所以现在的说法是：规则离</w:t>
       </w:r>
       <w:r>
         <w:rPr>
@@ -1112,7 +1132,7 @@
                 <w:sz w:val="17"/>
                 <w:szCs w:val="17"/>
               </w:rPr>
-              <w:t xml:space="preserve">[0.00, 0.72]</w:t>
+              <w:t xml:space="preserve">[0.04, 0.69]</w:t>
             </w:r>
           </w:p>
         </w:tc>
@@ -1139,7 +1159,7 @@
                 <w:sz w:val="17"/>
                 <w:szCs w:val="17"/>
               </w:rPr>
-              <w:t xml:space="preserve">[0.15, 0.81]</w:t>
+              <w:t xml:space="preserve">[0.15, 0.88]</w:t>
             </w:r>
           </w:p>
         </w:tc>
@@ -1158,29 +1178,7 @@
           <w:sz w:val="15"/>
           <w:szCs w:val="15"/>
         </w:rPr>
-        <w:t xml:space="preserve">最后一行来自嵌套自助（70 次外层重抽 × 18 次内层划分）。第二轮审稿指出我们原来的实现有泄漏：自助样本里同一个病人的多个副本可能被分到划分的两侧。改成按病人 ID 划分后区间反而变窄了。跨划分标准误 0.0105，其中真正的跨队列成分是 0.151——是前者的 </w:t>
-      </w:r>
-      <w:r>
-        <w:rPr>
-          <w:rFonts w:ascii="Noto Sans CJK SC" w:cs="Noto Sans CJK SC" w:eastAsia="Noto Sans CJK SC" w:hAnsi="Noto Sans CJK SC"/>
-          <w:b/>
-          <w:bCs/>
-          <w:color w:val="666666"/>
-          <w:sz w:val="15"/>
-          <w:szCs w:val="15"/>
-        </w:rPr>
-        <w:t xml:space="preserve">14 倍</w:t>
-      </w:r>
-      <w:r>
-        <w:rPr>
-          <w:rFonts w:ascii="Noto Serif CJK SC" w:cs="Noto Serif CJK SC" w:eastAsia="Noto Serif CJK SC" w:hAnsi="Noto Serif CJK SC"/>
-          <w:b w:val="false"/>
-          <w:bCs w:val="false"/>
-          <w:color w:val="666666"/>
-          <w:sz w:val="15"/>
-          <w:szCs w:val="15"/>
-        </w:rPr>
-        <w:t xml:space="preserve">。</w:t>
+        <w:t xml:space="preserve">最后一行来自嵌套自助（150 次外层重抽 × 25 次内层划分），也是全文唯一的区间口径：外层自助分布的 95% 百分位区间。第二轮审稿指出原实现有泄漏——自助样本里同一病人的副本可能落到划分两侧；改成按病人 ID 划分后区间反而变窄。总标准差 0.194 中，内层蒙特卡洛成分 0.084、外层抽样成分 0.174。</w:t>
       </w:r>
     </w:p>
     <w:p>
@@ -2216,7 +2214,7 @@
           <w:sz w:val="19"/>
           <w:szCs w:val="19"/>
         </w:rPr>
-        <w:t xml:space="preserve">因为入组人数通常不是唯一目的。随机放宽确实能多招人，但招进来的人群里疗效估计会更差（colon 平均风险比 0.686 vs 规则的 0.663，Rotterdam 0.805 vs 0.718）。规则换来的可能是估计质量，代价是比它能做到的少招一些人。需要说清楚的是：在</w:t>
+        <w:t xml:space="preserve">因为入组人数通常不是唯一目的。规则换来的可能是估计质量，代价是比它能做到的少招一些人。但需要说清楚：在</w:t>
       </w:r>
       <w:r>
         <w:rPr>

</xml_diff>

<commit_message>
Sixth revision: patient-level uncertainty for the three-way results, paired rule comparison, and a title that matches the evidence
</commit_message>
<xml_diff>
--- a/explainer/文章解读_中文.docx
+++ b/explainer/文章解读_中文.docx
@@ -102,17 +102,17 @@
           <w:sz w:val="19"/>
           <w:szCs w:val="19"/>
         </w:rPr>
-        <w:t xml:space="preserve">：点估计在 colon 是 63.4%、Rotterdam 是 57.1%，但把不确定性做到病人层面之后，区间都包含 0.5。它落在「人数—风险比」经验前沿上的比例只有 3.0% 和 1.0%；不过这个前沿本身是从同一批留出数据里挑最优挑出来的，带乐观偏倚，我们另外量化了这个偏倚有多大。至于疗效估计要多少数据才够，我们的答案是</w:t>
-      </w:r>
-      <w:r>
-        <w:rPr>
-          <w:rFonts w:ascii="Noto Sans CJK SC" w:cs="Noto Sans CJK SC" w:eastAsia="Noto Sans CJK SC" w:hAnsi="Noto Sans CJK SC"/>
-          <w:b/>
-          <w:bCs/>
-          <w:sz w:val="19"/>
-          <w:szCs w:val="19"/>
-        </w:rPr>
-        <w:t xml:space="preserve">给不出来</w:t>
+        <w:t xml:space="preserve">：点估计在 colon 是 63.4%、Rotterdam 是 57.1%，但把不确定性做到病人层面之后，区间都包含 0.5。它落在「人数—风险比」经验前沿上的比例只有 3.0% 和 1.0%；不过这个前沿本身是从同一批留出数据里挑最优挑出来的，带乐观偏倚，我们另外量化了这个偏倚有多大。至于疗效估计要多少数据才够：在我们模拟的这些机制里，</w:t>
+      </w:r>
+      <w:r>
+        <w:rPr>
+          <w:rFonts w:ascii="Noto Sans CJK SC" w:cs="Noto Sans CJK SC" w:eastAsia="Noto Sans CJK SC" w:hAnsi="Noto Sans CJK SC"/>
+          <w:b/>
+          <w:bCs/>
+          <w:sz w:val="19"/>
+          <w:szCs w:val="19"/>
+        </w:rPr>
+        <w:t xml:space="preserve">单靠队列人数、事件数或有效样本量都定不出一个通用的门槛</w:t>
       </w:r>
       <w:r>
         <w:rPr>
@@ -142,7 +142,7 @@
           <w:sz w:val="19"/>
           <w:szCs w:val="19"/>
         </w:rPr>
-        <w:t xml:space="preserve">——第三轮我们曾说是「最强的那条稀释性标准」，这一条已经撤回。这是一个否定性结论，也是我们认为最有用的一条。</w:t>
+        <w:t xml:space="preserve">（第六轮审稿指出 16 个情景只能说明机制间有异质性，不能证明这种要求「不存在」，标题已改）——第三轮我们曾说是「最强的那条稀释性标准」，这一条已经撤回。这是一个否定性结论，也是我们认为最有用的一条。</w:t>
       </w:r>
     </w:p>
     <w:p>
@@ -589,7 +589,7 @@
           <w:sz w:val="19"/>
           <w:szCs w:val="19"/>
         </w:rPr>
-        <w:t xml:space="preserve">——colon 只有 35.3% 仍然支配，规则未被任何预选子集支配的比例是 21.0%（Rotterdam 12.0%），比经验口径的 3.0%／1.0% 高好几倍；(c) 在检验那一份上重新扫描全部 512 个子集，仍然是经验最优，只作描述。方向不变（大多数划分里规则仍被支配），但只报 (a) 会把差距夸大。所以现在的说法是：规则离</w:t>
+        <w:t xml:space="preserve">——colon 只有 35.3% 仍然支配，规则未被任何预选子集支配的比例是 21.0%（Rotterdam 12.0%），病人层面区间 [0.04, 0.36] 和 [0.04, 0.36]，而同一个三分设计下挑选份上的经验口径只有 2.5%／2.7%（第六轮审稿要求和同一设计比，不能跟对半划分比，后者同时改变了评价集大小）；(c) 在检验那一份上重新扫描全部 512 个子集，仍然是经验最优，只作描述。方向不变（大多数划分里规则仍被支配），但只报 (a) 会把差距夸大。所以现在的说法是：规则离</w:t>
       </w:r>
       <w:r>
         <w:rPr>
@@ -1679,7 +1679,7 @@
           <w:sz w:val="19"/>
           <w:szCs w:val="19"/>
         </w:rPr>
-        <w:t xml:space="preserve">「多纳入病人」被当成经过验证的收益来写，其实是构造性的（见发现 1）。已全文改写并补上随机放宽对照。</w:t>
+        <w:t xml:space="preserve">「多纳入病人」被当成经过验证的收益，其实是构造性的（见发现 1）。已全文改写。</w:t>
       </w:r>
     </w:p>
     <w:p>
@@ -1783,7 +1783,7 @@
           <w:sz w:val="19"/>
           <w:szCs w:val="19"/>
         </w:rPr>
-        <w:t xml:space="preserve">第二轮：只用「能观察到阈值」的 6 个情景算离散度有选择偏倚，据此得出的「事件数比人数更不稳」</w:t>
+        <w:t xml:space="preserve">第二轮：只用「能观察到阈值」的 6 个情景算离散度有选择偏倚，据此得出的结论</w:t>
       </w:r>
       <w:r>
         <w:rPr>
@@ -2290,7 +2290,7 @@
     </w:p>
     <w:sectPr>
       <w:pgSz w:w="12240" w:h="15840" w:orient="portrait"/>
-      <w:pgMar w:top="760" w:right="1000" w:bottom="720" w:left="1000" w:header="708" w:footer="708" w:gutter="0"/>
+      <w:pgMar w:top="700" w:right="950" w:bottom="660" w:left="950" w:header="708" w:footer="708" w:gutter="0"/>
       <w:pgNumType/>
       <w:docGrid w:linePitch="360"/>
     </w:sectPr>

</xml_diff>